<commit_message>
Some work on part 1
</commit_message>
<xml_diff>
--- a/Lab B Tasks.docx
+++ b/Lab B Tasks.docx
@@ -360,30 +360,51 @@
     </w:p>
     <w:p>
       <w:r>
+        <w:rPr>
+          <w:highlight w:val="green"/>
+        </w:rPr>
         <w:t xml:space="preserve">First, solve the </w:t>
       </w:r>
       <w:proofErr w:type="spellStart"/>
       <w:r>
+        <w:rPr>
+          <w:highlight w:val="green"/>
+        </w:rPr>
         <w:t>segfault</w:t>
       </w:r>
       <w:proofErr w:type="spellEnd"/>
       <w:r>
+        <w:rPr>
+          <w:highlight w:val="green"/>
+        </w:rPr>
         <w:t xml:space="preserve"> using </w:t>
       </w:r>
       <w:proofErr w:type="spellStart"/>
       <w:r>
+        <w:rPr>
+          <w:highlight w:val="green"/>
+        </w:rPr>
         <w:t>gdb</w:t>
       </w:r>
       <w:proofErr w:type="spellEnd"/>
       <w:r>
+        <w:rPr>
+          <w:highlight w:val="green"/>
+        </w:rPr>
         <w:t xml:space="preserve"> (or just by reading the code). Then use </w:t>
       </w:r>
       <w:proofErr w:type="spellStart"/>
       <w:r>
+        <w:rPr>
+          <w:highlight w:val="green"/>
+        </w:rPr>
         <w:t>Valgrind</w:t>
       </w:r>
       <w:proofErr w:type="spellEnd"/>
       <w:r>
+        <w:rPr>
+          <w:highlight w:val="green"/>
+        </w:rPr>
         <w:t xml:space="preserve"> to find the memory leaks and fix them.</w:t>
       </w:r>
     </w:p>

</xml_diff>

<commit_message>
A lot of work for part1
</commit_message>
<xml_diff>
--- a/Lab B Tasks.docx
+++ b/Lab B Tasks.docx
@@ -99,15 +99,7 @@
       </w:r>
       <w:proofErr w:type="spellEnd"/>
       <w:r>
-        <w:t xml:space="preserve"> to make sure your program is "memory-leak" free. If you use the VM we supplied you, you should install the library libc6-</w:t>
-      </w:r>
-      <w:proofErr w:type="gramStart"/>
-      <w:r>
-        <w:t>dbg:i</w:t>
-      </w:r>
-      <w:proofErr w:type="gramEnd"/>
-      <w:r>
-        <w:t xml:space="preserve">386 by running </w:t>
+        <w:t xml:space="preserve"> to make sure your program is "memory-leak" free. If you use the VM we supplied you, you should install the library libc6-dbg:i386 by running </w:t>
       </w:r>
       <w:proofErr w:type="spellStart"/>
       <w:r>
@@ -115,15 +107,7 @@
       </w:r>
       <w:proofErr w:type="spellEnd"/>
       <w:r>
-        <w:t xml:space="preserve"> apt-get install libc6-</w:t>
-      </w:r>
-      <w:proofErr w:type="gramStart"/>
-      <w:r>
-        <w:t>dbg:i</w:t>
-      </w:r>
-      <w:proofErr w:type="gramEnd"/>
-      <w:r>
-        <w:t xml:space="preserve">386 You should use </w:t>
+        <w:t xml:space="preserve"> apt-get install libc6-dbg:i386 You should use </w:t>
       </w:r>
       <w:proofErr w:type="spellStart"/>
       <w:r>
@@ -191,17 +175,12 @@
         <w:t xml:space="preserve">Programs inevitably contain bugs, at least when they are still being developed. Interactive debugging using </w:t>
       </w:r>
       <w:proofErr w:type="spellStart"/>
-      <w:proofErr w:type="gramStart"/>
       <w:r>
         <w:t>valgrind</w:t>
       </w:r>
       <w:proofErr w:type="spellEnd"/>
       <w:r>
-        <w:t>(</w:t>
-      </w:r>
-      <w:proofErr w:type="gramEnd"/>
-      <w:r>
-        <w:t xml:space="preserve">1) helps locate and eliminate bugs. </w:t>
+        <w:t xml:space="preserve">(1) helps locate and eliminate bugs. </w:t>
       </w:r>
       <w:proofErr w:type="spellStart"/>
       <w:r>
@@ -330,15 +309,7 @@
     <w:p>
       <w:r>
         <w:lastRenderedPageBreak/>
-        <w:t xml:space="preserve">However, </w:t>
-      </w:r>
-      <w:proofErr w:type="gramStart"/>
-      <w:r>
-        <w:t>an illegal</w:t>
-      </w:r>
-      <w:proofErr w:type="gramEnd"/>
-      <w:r>
-        <w:t xml:space="preserve"> memory access causes a segmentation fault (</w:t>
+        <w:t>However, an illegal memory access causes a segmentation fault (</w:t>
       </w:r>
       <w:proofErr w:type="spellStart"/>
       <w:r>
@@ -421,17 +392,12 @@
         <w:t xml:space="preserve">). Consult the </w:t>
       </w:r>
       <w:proofErr w:type="spellStart"/>
-      <w:proofErr w:type="gramStart"/>
       <w:r>
         <w:t>printf</w:t>
       </w:r>
       <w:proofErr w:type="spellEnd"/>
       <w:r>
-        <w:t>(</w:t>
-      </w:r>
-      <w:proofErr w:type="gramEnd"/>
-      <w:r>
-        <w:t>3) man page for hexadecimal format printing.</w:t>
+        <w:t>(3) man page for hexadecimal format printing.</w:t>
       </w:r>
     </w:p>
     <w:p>
@@ -534,17 +500,12 @@
         </w:numPr>
       </w:pPr>
       <w:proofErr w:type="spellStart"/>
-      <w:proofErr w:type="gramStart"/>
       <w:r>
         <w:t>fread</w:t>
       </w:r>
       <w:proofErr w:type="spellEnd"/>
       <w:r>
-        <w:t>(</w:t>
-      </w:r>
-      <w:proofErr w:type="gramEnd"/>
-      <w:r>
-        <w:t>3) to read data from the file into memory.</w:t>
+        <w:t>(3) to read data from the file into memory.</w:t>
       </w:r>
     </w:p>
     <w:p>
@@ -558,17 +519,12 @@
         <w:t xml:space="preserve">A helper function, </w:t>
       </w:r>
       <w:proofErr w:type="spellStart"/>
-      <w:proofErr w:type="gramStart"/>
       <w:r>
         <w:t>PrintHex</w:t>
       </w:r>
       <w:proofErr w:type="spellEnd"/>
       <w:r>
-        <w:t>(</w:t>
-      </w:r>
-      <w:proofErr w:type="gramEnd"/>
-      <w:r>
-        <w:t>buffer, length), that prints length bytes from memory location buffer, in hexadecimal format.</w:t>
+        <w:t>(buffer, length), that prints length bytes from memory location buffer, in hexadecimal format.</w:t>
       </w:r>
     </w:p>
     <w:p>
@@ -631,15 +587,7 @@
       </w:r>
       <w:proofErr w:type="spellEnd"/>
       <w:r>
-        <w:t xml:space="preserve"> program, to detect computer viruses </w:t>
-      </w:r>
-      <w:proofErr w:type="gramStart"/>
-      <w:r>
-        <w:t>in a given</w:t>
-      </w:r>
-      <w:proofErr w:type="gramEnd"/>
-      <w:r>
-        <w:t xml:space="preserve"> suspected file.</w:t>
+        <w:t> program, to detect computer viruses in a given suspected file.</w:t>
       </w:r>
     </w:p>
     <w:p>
@@ -673,15 +621,7 @@
       </w:r>
       <w:proofErr w:type="spellEnd"/>
       <w:r>
-        <w:t xml:space="preserve"> compares the content of the user-selected FILE byte-by-byte with a pre</w:t>
-      </w:r>
-      <w:proofErr w:type="gramStart"/>
-      <w:r>
-        <w:t>-  defined</w:t>
-      </w:r>
-      <w:proofErr w:type="gramEnd"/>
-      <w:r>
-        <w:t xml:space="preserve"> set of viruses described in a SIGNATURES file. The comparison is done according to a naive   algorithm described in task 2.</w:t>
+        <w:t xml:space="preserve"> compares the content of the user-selected FILE byte-by-byte with a pre- defined set of viruses described in a SIGNATURES file. The comparison is done according to a naive algorithm described in task 2.</w:t>
       </w:r>
     </w:p>
     <w:p>
@@ -701,15 +641,7 @@
     </w:p>
     <w:p>
       <w:r>
-        <w:t xml:space="preserve">In the current part you are required to read the signatures of the viruses from the signatures file and to store these signatures in a dedicated linked list data structure. </w:t>
-      </w:r>
-      <w:proofErr w:type="gramStart"/>
-      <w:r>
-        <w:t>Note,</w:t>
-      </w:r>
-      <w:proofErr w:type="gramEnd"/>
-      <w:r>
-        <w:t xml:space="preserve"> that the command-line argument FILE is not used in subparts 1a and 1b below. At a later stage (part 1c) you will compare the virus signatures from the list to byte sequences from a suspected file, designated by the program user.</w:t>
+        <w:t>In the current part you are required to read the signatures of the viruses from the signatures file and to store these signatures in a dedicated linked list data structure. Note, that the command-line argument FILE is not used in subparts 1a and 1b below. At a later stage (part 1c) you will compare the virus signatures from the list to byte sequences from a suspected file, designated by the program user.</w:t>
       </w:r>
     </w:p>
     <w:p>
@@ -742,13 +674,8 @@
         <w:t xml:space="preserve"> of 4 bytes, that is used to quickly check that this is the right type of file, followed immediately by the details of different viruses in a specific format. The magic number of the signature file is the character sequence "VIRL" for little-endian encoding, and "VIRB" for big-endian encoding. The rest of the file (after the magic number) consists of blocks (&lt; </w:t>
       </w:r>
       <w:proofErr w:type="spellStart"/>
-      <w:proofErr w:type="gramStart"/>
-      <w:r>
-        <w:t>N,name</w:t>
-      </w:r>
-      <w:proofErr w:type="gramEnd"/>
-      <w:r>
-        <w:t>,signature</w:t>
+      <w:r>
+        <w:t>N,name,signature</w:t>
       </w:r>
       <w:proofErr w:type="spellEnd"/>
       <w:r>
@@ -779,14 +706,14 @@
         <w:tblLook w:val="04A0" w:firstRow="1" w:lastRow="0" w:firstColumn="1" w:lastColumn="0" w:noHBand="0" w:noVBand="1"/>
       </w:tblPr>
       <w:tblGrid>
-        <w:gridCol w:w="1499"/>
-        <w:gridCol w:w="2915"/>
-        <w:gridCol w:w="17186"/>
+        <w:gridCol w:w="1522"/>
+        <w:gridCol w:w="1980"/>
+        <w:gridCol w:w="18098"/>
       </w:tblGrid>
       <w:tr>
         <w:tc>
           <w:tcPr>
-            <w:tcW w:w="0" w:type="auto"/>
+            <w:tcW w:w="1522" w:type="dxa"/>
             <w:tcBorders>
               <w:top w:val="single" w:sz="6" w:space="0" w:color="DDDDDD"/>
               <w:left w:val="single" w:sz="6" w:space="0" w:color="DDDDDD"/>
@@ -820,7 +747,7 @@
         </w:tc>
         <w:tc>
           <w:tcPr>
-            <w:tcW w:w="0" w:type="auto"/>
+            <w:tcW w:w="1980" w:type="dxa"/>
             <w:tcBorders>
               <w:top w:val="single" w:sz="6" w:space="0" w:color="DDDDDD"/>
               <w:left w:val="single" w:sz="6" w:space="0" w:color="DDDDDD"/>
@@ -854,7 +781,7 @@
         </w:tc>
         <w:tc>
           <w:tcPr>
-            <w:tcW w:w="0" w:type="auto"/>
+            <w:tcW w:w="18098" w:type="dxa"/>
             <w:tcBorders>
               <w:top w:val="single" w:sz="6" w:space="0" w:color="DDDDDD"/>
               <w:left w:val="single" w:sz="6" w:space="0" w:color="DDDDDD"/>
@@ -890,7 +817,7 @@
       <w:tr>
         <w:tc>
           <w:tcPr>
-            <w:tcW w:w="0" w:type="auto"/>
+            <w:tcW w:w="1522" w:type="dxa"/>
             <w:tcBorders>
               <w:top w:val="single" w:sz="6" w:space="0" w:color="DDDDDD"/>
               <w:left w:val="single" w:sz="6" w:space="0" w:color="DDDDDD"/>
@@ -914,7 +841,7 @@
         </w:tc>
         <w:tc>
           <w:tcPr>
-            <w:tcW w:w="0" w:type="auto"/>
+            <w:tcW w:w="1980" w:type="dxa"/>
             <w:tcBorders>
               <w:top w:val="single" w:sz="6" w:space="0" w:color="DDDDDD"/>
               <w:left w:val="single" w:sz="6" w:space="0" w:color="DDDDDD"/>
@@ -938,7 +865,7 @@
         </w:tc>
         <w:tc>
           <w:tcPr>
-            <w:tcW w:w="0" w:type="auto"/>
+            <w:tcW w:w="18098" w:type="dxa"/>
             <w:tcBorders>
               <w:top w:val="single" w:sz="6" w:space="0" w:color="DDDDDD"/>
               <w:left w:val="single" w:sz="6" w:space="0" w:color="DDDDDD"/>
@@ -956,7 +883,22 @@
           </w:tcPr>
           <w:p>
             <w:r>
-              <w:t>The virus's signature length N, up to 2^16 little endian or big endian depending on magic number</w:t>
+              <w:t>The virus's </w:t>
+            </w:r>
+            <w:r>
+              <w:rPr>
+                <w:b/>
+                <w:bCs/>
+              </w:rPr>
+              <w:t>signature length N</w:t>
+            </w:r>
+            <w:r>
+              <w:t xml:space="preserve">, </w:t>
+            </w:r>
+          </w:p>
+          <w:p>
+            <w:r>
+              <w:t>up to 2^16 little endian or big endian depending on magic number</w:t>
             </w:r>
           </w:p>
         </w:tc>
@@ -964,7 +906,7 @@
       <w:tr>
         <w:tc>
           <w:tcPr>
-            <w:tcW w:w="0" w:type="auto"/>
+            <w:tcW w:w="1522" w:type="dxa"/>
             <w:tcBorders>
               <w:top w:val="single" w:sz="6" w:space="0" w:color="DDDDDD"/>
               <w:left w:val="single" w:sz="6" w:space="0" w:color="DDDDDD"/>
@@ -988,7 +930,7 @@
         </w:tc>
         <w:tc>
           <w:tcPr>
-            <w:tcW w:w="0" w:type="auto"/>
+            <w:tcW w:w="1980" w:type="dxa"/>
             <w:tcBorders>
               <w:top w:val="single" w:sz="6" w:space="0" w:color="DDDDDD"/>
               <w:left w:val="single" w:sz="6" w:space="0" w:color="DDDDDD"/>
@@ -1012,7 +954,7 @@
         </w:tc>
         <w:tc>
           <w:tcPr>
-            <w:tcW w:w="0" w:type="auto"/>
+            <w:tcW w:w="18098" w:type="dxa"/>
             <w:tcBorders>
               <w:top w:val="single" w:sz="6" w:space="0" w:color="DDDDDD"/>
               <w:left w:val="single" w:sz="6" w:space="0" w:color="DDDDDD"/>
@@ -1030,7 +972,20 @@
           </w:tcPr>
           <w:p>
             <w:r>
-              <w:t>The virus name represented as a null terminated string</w:t>
+              <w:rPr>
+                <w:b/>
+                <w:bCs/>
+              </w:rPr>
+              <w:t>The virus name</w:t>
+            </w:r>
+            <w:r>
+              <w:t> represented as a null</w:t>
+            </w:r>
+            <w:r>
+              <w:t xml:space="preserve"> </w:t>
+            </w:r>
+            <w:r>
+              <w:t>terminated string</w:t>
             </w:r>
           </w:p>
         </w:tc>
@@ -1038,7 +993,7 @@
       <w:tr>
         <w:tc>
           <w:tcPr>
-            <w:tcW w:w="0" w:type="auto"/>
+            <w:tcW w:w="1522" w:type="dxa"/>
             <w:tcBorders>
               <w:top w:val="single" w:sz="6" w:space="0" w:color="DDDDDD"/>
               <w:left w:val="single" w:sz="6" w:space="0" w:color="DDDDDD"/>
@@ -1063,7 +1018,7 @@
         </w:tc>
         <w:tc>
           <w:tcPr>
-            <w:tcW w:w="0" w:type="auto"/>
+            <w:tcW w:w="1980" w:type="dxa"/>
             <w:tcBorders>
               <w:top w:val="single" w:sz="6" w:space="0" w:color="DDDDDD"/>
               <w:left w:val="single" w:sz="6" w:space="0" w:color="DDDDDD"/>
@@ -1087,7 +1042,7 @@
         </w:tc>
         <w:tc>
           <w:tcPr>
-            <w:tcW w:w="0" w:type="auto"/>
+            <w:tcW w:w="18098" w:type="dxa"/>
             <w:tcBorders>
               <w:top w:val="single" w:sz="6" w:space="0" w:color="DDDDDD"/>
               <w:left w:val="single" w:sz="6" w:space="0" w:color="DDDDDD"/>
@@ -1104,7 +1059,17 @@
             <w:hideMark/>
           </w:tcPr>
           <w:p>
+            <w:pPr>
+              <w:rPr>
+                <w:b/>
+                <w:bCs/>
+              </w:rPr>
+            </w:pPr>
             <w:r>
+              <w:rPr>
+                <w:b/>
+                <w:bCs/>
+              </w:rPr>
               <w:t>The virus signature</w:t>
             </w:r>
           </w:p>
@@ -1127,7 +1092,15 @@
       </w:r>
       <w:r>
         <w:br/>
-        <w:t>05 00 56 49 52 55 53 00 00 00 00 00 00 00 00 00 00 00 31 32 33 34 35</w:t>
+      </w:r>
+      <w:r>
+        <w:rPr>
+          <w:color w:val="EE0000"/>
+        </w:rPr>
+        <w:t>05 00 </w:t>
+      </w:r>
+      <w:r>
+        <w:t>56 49 52 55 53 00 00 00 00 00 00 00 00 00 00 00 31 32 33 34 35</w:t>
       </w:r>
       <w:r>
         <w:br/>
@@ -1152,15 +1125,7 @@
     <w:p>
       <w:r>
         <w:br/>
-        <w:t xml:space="preserve">You are given the following </w:t>
-      </w:r>
-      <w:proofErr w:type="gramStart"/>
-      <w:r>
-        <w:t>struct</w:t>
-      </w:r>
-      <w:proofErr w:type="gramEnd"/>
-      <w:r>
-        <w:t xml:space="preserve"> that represents a virus description. You are required to use it in your implementation of all the tasks.</w:t>
+        <w:t>You are given the following struct that represents a virus description. You are required to use it in your implementation of all the tasks.</w:t>
       </w:r>
       <w:r>
         <w:br/>
@@ -1199,13 +1164,8 @@
       </w:r>
       <w:r>
         <w:br/>
-        <w:t xml:space="preserve">} </w:t>
-      </w:r>
-      <w:proofErr w:type="gramStart"/>
-      <w:r>
-        <w:t>virus;</w:t>
-      </w:r>
-      <w:proofErr w:type="gramEnd"/>
+        <w:t>} virus;</w:t>
+      </w:r>
     </w:p>
     <w:p>
       <w:r>
@@ -1224,43 +1184,28 @@
         <w:t xml:space="preserve">virus* </w:t>
       </w:r>
       <w:proofErr w:type="spellStart"/>
-      <w:proofErr w:type="gramStart"/>
       <w:r>
         <w:t>readVirus</w:t>
       </w:r>
       <w:proofErr w:type="spellEnd"/>
       <w:r>
-        <w:t>(</w:t>
-      </w:r>
-      <w:proofErr w:type="gramEnd"/>
-      <w:r>
-        <w:t xml:space="preserve">FILE*): this function receives a file pointer and returns a virus* that represents the next virus in the file. To read from a file, use </w:t>
-      </w:r>
-      <w:proofErr w:type="spellStart"/>
-      <w:proofErr w:type="gramStart"/>
+        <w:t xml:space="preserve">(FILE*): this function receives a file pointer and returns a virus* that represents the next virus in the file. To read from a file, use </w:t>
+      </w:r>
+      <w:proofErr w:type="spellStart"/>
       <w:r>
         <w:t>fread</w:t>
       </w:r>
       <w:proofErr w:type="spellEnd"/>
       <w:r>
-        <w:t>(</w:t>
-      </w:r>
-      <w:proofErr w:type="gramEnd"/>
-      <w:r>
-        <w:t xml:space="preserve">). See man </w:t>
-      </w:r>
-      <w:proofErr w:type="spellStart"/>
-      <w:proofErr w:type="gramStart"/>
+        <w:t xml:space="preserve">(). See man </w:t>
+      </w:r>
+      <w:proofErr w:type="spellStart"/>
       <w:r>
         <w:t>fread</w:t>
       </w:r>
       <w:proofErr w:type="spellEnd"/>
       <w:r>
-        <w:t>(</w:t>
-      </w:r>
-      <w:proofErr w:type="gramEnd"/>
-      <w:r>
-        <w:t>3) for assistance.</w:t>
+        <w:t>(3) for assistance.</w:t>
       </w:r>
     </w:p>
     <w:p>
@@ -1270,26 +1215,16 @@
           <w:numId w:val="3"/>
         </w:numPr>
       </w:pPr>
-      <w:proofErr w:type="gramStart"/>
-      <w:r>
-        <w:t>void</w:t>
-      </w:r>
-      <w:proofErr w:type="gramEnd"/>
-      <w:r>
-        <w:t xml:space="preserve"> </w:t>
-      </w:r>
-      <w:proofErr w:type="spellStart"/>
-      <w:proofErr w:type="gramStart"/>
+      <w:r>
+        <w:t xml:space="preserve">void </w:t>
+      </w:r>
+      <w:proofErr w:type="spellStart"/>
       <w:r>
         <w:t>printVirus</w:t>
       </w:r>
       <w:proofErr w:type="spellEnd"/>
       <w:r>
-        <w:t>(virus</w:t>
-      </w:r>
-      <w:proofErr w:type="gramEnd"/>
-      <w:r>
-        <w:t>* virus, FILE* output): this function receives a virus and a pointer to an output file. The function prints the virus to the given output. It prints the virus name (in ASCII), the virus signature length (in decimal), and the virus signature (in hexadecimal representation).</w:t>
+        <w:t>(virus* virus, FILE* output): this function receives a virus and a pointer to an output file. The function prints the virus to the given output. It prints the virus name (in ASCII), the virus signature length (in decimal), and the virus signature (in hexadecimal representation).</w:t>
       </w:r>
     </w:p>
     <w:p>
@@ -1305,15 +1240,7 @@
         </w:numPr>
       </w:pPr>
       <w:r>
-        <w:t xml:space="preserve">Open the signatures file, check the magic number. If the magic number is </w:t>
-      </w:r>
-      <w:proofErr w:type="gramStart"/>
-      <w:r>
-        <w:t>incorrect(</w:t>
-      </w:r>
-      <w:proofErr w:type="gramEnd"/>
-      <w:r>
-        <w:t>i.e. different from "</w:t>
+        <w:t>Open the signatures file, check the magic number. If the magic number is incorrect(i.e. different from "</w:t>
       </w:r>
       <w:proofErr w:type="spellStart"/>
       <w:r>
@@ -1321,15 +1248,7 @@
       </w:r>
       <w:proofErr w:type="spellEnd"/>
       <w:r>
-        <w:t xml:space="preserve"> "VIRB"</w:t>
-      </w:r>
-      <w:proofErr w:type="gramStart"/>
-      <w:r>
-        <w:t>) ,</w:t>
-      </w:r>
-      <w:proofErr w:type="gramEnd"/>
-      <w:r>
-        <w:t xml:space="preserve"> then print an error message, close the file, and return. If magic number is OK, use </w:t>
+        <w:t xml:space="preserve"> "VIRB") , then print an error message, close the file, and return. If magic number is OK, use </w:t>
       </w:r>
       <w:proofErr w:type="spellStart"/>
       <w:r>
@@ -1337,15 +1256,7 @@
       </w:r>
       <w:proofErr w:type="spellEnd"/>
       <w:r>
-        <w:t xml:space="preserve"> </w:t>
-      </w:r>
-      <w:proofErr w:type="gramStart"/>
-      <w:r>
-        <w:t>in order to</w:t>
-      </w:r>
-      <w:proofErr w:type="gramEnd"/>
-      <w:r>
-        <w:t xml:space="preserve"> read the viruses </w:t>
+        <w:t xml:space="preserve"> in order to read the viruses </w:t>
       </w:r>
       <w:r>
         <w:lastRenderedPageBreak/>
@@ -1357,15 +1268,7 @@
       </w:r>
       <w:proofErr w:type="spellEnd"/>
       <w:r>
-        <w:t xml:space="preserve"> </w:t>
-      </w:r>
-      <w:proofErr w:type="gramStart"/>
-      <w:r>
-        <w:t>in order to</w:t>
-      </w:r>
-      <w:proofErr w:type="gramEnd"/>
-      <w:r>
-        <w:t xml:space="preserve"> print the virus (to a file or to the standard output, up to your choice).</w:t>
+        <w:t xml:space="preserve"> in order to print the virus (to a file or to the standard output, up to your choice).</w:t>
       </w:r>
     </w:p>
     <w:p>
@@ -1376,13 +1279,11 @@
         </w:numPr>
       </w:pPr>
       <w:r>
-        <w:t xml:space="preserve">Test your implementation by comparing your output with the output example file. The exact output format is not important, as there will be frontal checking </w:t>
-      </w:r>
-      <w:proofErr w:type="spellStart"/>
-      <w:r>
-        <w:t>anf</w:t>
-      </w:r>
-      <w:proofErr w:type="spellEnd"/>
+        <w:t>Test your implementation by comparing your output with the output example file. The exact output format is not important, as there will be frontal checking an</w:t>
+      </w:r>
+      <w:r>
+        <w:t>d</w:t>
+      </w:r>
       <w:r>
         <w:t xml:space="preserve"> you may be required to change it in the grading session anyway.</w:t>
       </w:r>
@@ -1405,15 +1306,7 @@
       </w:r>
       <w:proofErr w:type="spellEnd"/>
       <w:r>
-        <w:t xml:space="preserve"> calls. You should read the first 2 bytes directly into the virus </w:t>
-      </w:r>
-      <w:proofErr w:type="gramStart"/>
-      <w:r>
-        <w:t>struct</w:t>
-      </w:r>
-      <w:proofErr w:type="gramEnd"/>
-      <w:r>
-        <w:t xml:space="preserve">. You may need to manipulate the size field. Then, allocate 16 bytes of memory for the </w:t>
+        <w:t xml:space="preserve"> calls. You should read the first 2 bytes directly into the virus struct. You may need to manipulate the size field. Then, allocate 16 bytes of memory for the </w:t>
       </w:r>
       <w:proofErr w:type="spellStart"/>
       <w:r>
@@ -1521,19 +1414,11 @@
       </w:r>
       <w:proofErr w:type="spellStart"/>
       <w:r>
-        <w:t>list_</w:t>
-      </w:r>
-      <w:proofErr w:type="gramStart"/>
-      <w:r>
-        <w:t>print</w:t>
-      </w:r>
-      <w:proofErr w:type="spellEnd"/>
-      <w:r>
-        <w:t>(</w:t>
-      </w:r>
-      <w:proofErr w:type="gramEnd"/>
-      <w:r>
-        <w:t>link *</w:t>
+        <w:t>list_print</w:t>
+      </w:r>
+      <w:proofErr w:type="spellEnd"/>
+      <w:r>
+        <w:t>(link *</w:t>
       </w:r>
       <w:proofErr w:type="spellStart"/>
       <w:r>
@@ -1560,19 +1445,11 @@
       </w:r>
       <w:proofErr w:type="spellStart"/>
       <w:r>
-        <w:t>list_</w:t>
-      </w:r>
-      <w:proofErr w:type="gramStart"/>
-      <w:r>
-        <w:t>append</w:t>
-      </w:r>
-      <w:proofErr w:type="spellEnd"/>
-      <w:r>
-        <w:t>(</w:t>
-      </w:r>
-      <w:proofErr w:type="gramEnd"/>
-      <w:r>
-        <w:t xml:space="preserve">link* </w:t>
+        <w:t>list_append</w:t>
+      </w:r>
+      <w:proofErr w:type="spellEnd"/>
+      <w:r>
+        <w:t xml:space="preserve">(link* </w:t>
       </w:r>
       <w:proofErr w:type="spellStart"/>
       <w:r>
@@ -1609,19 +1486,11 @@
       </w:r>
       <w:proofErr w:type="spellStart"/>
       <w:r>
-        <w:t>list_</w:t>
-      </w:r>
-      <w:proofErr w:type="gramStart"/>
-      <w:r>
-        <w:t>free</w:t>
-      </w:r>
-      <w:proofErr w:type="spellEnd"/>
-      <w:r>
-        <w:t>(</w:t>
-      </w:r>
-      <w:proofErr w:type="gramEnd"/>
-      <w:r>
-        <w:t>link *</w:t>
+        <w:t>list_free</w:t>
+      </w:r>
+      <w:proofErr w:type="spellEnd"/>
+      <w:r>
+        <w:t>(link *</w:t>
       </w:r>
       <w:proofErr w:type="spellStart"/>
       <w:r>
@@ -1639,15 +1508,7 @@
     <w:p>
       <w:r>
         <w:br/>
-        <w:t xml:space="preserve">To test your list </w:t>
-      </w:r>
-      <w:proofErr w:type="gramStart"/>
-      <w:r>
-        <w:t>implementation</w:t>
-      </w:r>
-      <w:proofErr w:type="gramEnd"/>
-      <w:r>
-        <w:t xml:space="preserve"> you are requested to write a program with the following prompt in an infinite loop. You should use the same scheme for printing and selecting </w:t>
+        <w:t xml:space="preserve">To test your list implementation you are requested to write a program with the following prompt in an infinite loop. You should use the same scheme for printing and selecting </w:t>
       </w:r>
       <w:r>
         <w:lastRenderedPageBreak/>
@@ -1763,15 +1624,7 @@
         </w:numPr>
       </w:pPr>
       <w:r>
-        <w:t xml:space="preserve">Creates a linked list that contains </w:t>
-      </w:r>
-      <w:proofErr w:type="gramStart"/>
-      <w:r>
-        <w:t>all of</w:t>
-      </w:r>
-      <w:proofErr w:type="gramEnd"/>
-      <w:r>
-        <w:t xml:space="preserve"> the viruses where each node represents a single virus.</w:t>
+        <w:t>Creates a linked list that contains all of the viruses where each node represents a single virus.</w:t>
       </w:r>
     </w:p>
     <w:p>
@@ -1810,14 +1663,7 @@
     <w:p>
       <w:r>
         <w:br/>
-      </w:r>
-      <w:proofErr w:type="gramStart"/>
-      <w:r>
-        <w:t>Now,</w:t>
-      </w:r>
-      <w:proofErr w:type="gramEnd"/>
-      <w:r>
-        <w:t xml:space="preserve"> that you have loaded the virus descriptions into memory, extend your </w:t>
+        <w:t xml:space="preserve">Now, that you have loaded the virus descriptions into memory, extend your </w:t>
       </w:r>
       <w:proofErr w:type="spellStart"/>
       <w:r>
@@ -1847,15 +1693,7 @@
         </w:numPr>
       </w:pPr>
       <w:r>
-        <w:t xml:space="preserve">Implement Detect </w:t>
-      </w:r>
-      <w:proofErr w:type="gramStart"/>
-      <w:r>
-        <w:t>viruses:</w:t>
-      </w:r>
-      <w:proofErr w:type="gramEnd"/>
-      <w:r>
-        <w:t xml:space="preserve"> operates after the user runs it by entering the appropriate character on the menu,</w:t>
+        <w:t>Implement Detect viruses: operates after the user runs it by entering the appropriate character on the menu,</w:t>
       </w:r>
     </w:p>
     <w:p>
@@ -1869,17 +1707,12 @@
         <w:t xml:space="preserve">Open the file selected by the user as above, and </w:t>
       </w:r>
       <w:proofErr w:type="spellStart"/>
-      <w:proofErr w:type="gramStart"/>
       <w:r>
         <w:t>fread</w:t>
       </w:r>
       <w:proofErr w:type="spellEnd"/>
       <w:r>
-        <w:t>(</w:t>
-      </w:r>
-      <w:proofErr w:type="gramEnd"/>
-      <w:r>
-        <w:t>) the entire contents of the suspected file into a buffer of constant size 10K bytes in memory. If no file has been selected or cannot read the file, issue an error message.</w:t>
+        <w:t>() the entire contents of the suspected file into a buffer of constant size 10K bytes in memory. If no file has been selected or cannot read the file, issue an error message.</w:t>
       </w:r>
     </w:p>
     <w:p>
@@ -1908,19 +1741,11 @@
       </w:r>
       <w:proofErr w:type="spellStart"/>
       <w:r>
-        <w:t>detect_</w:t>
-      </w:r>
-      <w:proofErr w:type="gramStart"/>
-      <w:r>
-        <w:t>virus</w:t>
-      </w:r>
-      <w:proofErr w:type="spellEnd"/>
-      <w:r>
-        <w:t>(</w:t>
-      </w:r>
-      <w:proofErr w:type="gramEnd"/>
-      <w:r>
-        <w:t>char *buffer, unsigned int size, link *</w:t>
+        <w:t>detect_virus</w:t>
+      </w:r>
+      <w:proofErr w:type="spellEnd"/>
+      <w:r>
+        <w:t>(char *buffer, unsigned int size, link *</w:t>
       </w:r>
       <w:proofErr w:type="spellStart"/>
       <w:r>
@@ -1954,13 +1779,8 @@
         <w:t xml:space="preserve"> linked list. size should be the minimum between the size of the buffer and the size of the suspected file in bytes. If a virus is detected, for each detected virus the </w:t>
       </w:r>
       <w:proofErr w:type="spellStart"/>
-      <w:proofErr w:type="gramStart"/>
-      <w:r>
-        <w:t>detect</w:t>
-      </w:r>
-      <w:proofErr w:type="gramEnd"/>
-      <w:r>
-        <w:t>_virus</w:t>
+      <w:r>
+        <w:t>detect_virus</w:t>
       </w:r>
       <w:proofErr w:type="spellEnd"/>
       <w:r>
@@ -2006,7 +1826,6 @@
         <w:t>If no viruses were detected, the function does not print anything. Use the </w:t>
       </w:r>
       <w:proofErr w:type="spellStart"/>
-      <w:proofErr w:type="gramStart"/>
       <w:r>
         <w:rPr>
           <w:b/>
@@ -2020,122 +1839,85 @@
           <w:b/>
           <w:bCs/>
         </w:rPr>
-        <w:t>(</w:t>
-      </w:r>
-      <w:proofErr w:type="gramEnd"/>
-      <w:r>
+        <w:t>(3)</w:t>
+      </w:r>
+      <w:r>
+        <w:t> function to compare the bytes of the respective virus signature with the bytes of the suspected file.</w:t>
+      </w:r>
+      <w:r>
+        <w:br/>
+        <w:t>You can test your program by applying it to the given file.</w:t>
+      </w:r>
+    </w:p>
+    <w:p>
+      <w:pPr>
         <w:rPr>
           <w:b/>
           <w:bCs/>
         </w:rPr>
-        <w:t>3)</w:t>
-      </w:r>
-      <w:r>
-        <w:t> function to compare the bytes of the respective virus signature with the bytes of the suspected file.</w:t>
-      </w:r>
-      <w:r>
-        <w:br/>
-        <w:t>You can test your program by applying it to the given file.</w:t>
-      </w:r>
-    </w:p>
-    <w:p>
-      <w:pPr>
+      </w:pPr>
+      <w:r>
         <w:rPr>
           <w:b/>
           <w:bCs/>
         </w:rPr>
-      </w:pPr>
-      <w:r>
+        <w:t>Part 2: Anti-virus Simulation</w:t>
+      </w:r>
+    </w:p>
+    <w:p>
+      <w:r>
+        <w:br/>
+        <w:t>In this task you will test your virus detector, and use it to help neutralizing viruses from a file. The neutralization assumes that the virus is a function that does something and returns.</w:t>
+      </w:r>
+      <w:r>
+        <w:br/>
+      </w:r>
+    </w:p>
+    <w:p>
+      <w:pPr>
         <w:rPr>
           <w:b/>
           <w:bCs/>
         </w:rPr>
-        <w:t>Part 2: Anti-virus Simulation</w:t>
-      </w:r>
-    </w:p>
-    <w:p>
-      <w:r>
-        <w:br/>
-        <w:t xml:space="preserve">In this task you will test your virus </w:t>
-      </w:r>
-      <w:proofErr w:type="gramStart"/>
-      <w:r>
-        <w:t>detector, and</w:t>
-      </w:r>
-      <w:proofErr w:type="gramEnd"/>
-      <w:r>
-        <w:t xml:space="preserve"> use it to help </w:t>
-      </w:r>
-      <w:proofErr w:type="gramStart"/>
-      <w:r>
-        <w:t>neutralizing</w:t>
-      </w:r>
-      <w:proofErr w:type="gramEnd"/>
-      <w:r>
-        <w:t xml:space="preserve"> viruses from a file. </w:t>
-      </w:r>
-      <w:proofErr w:type="gramStart"/>
-      <w:r>
-        <w:t>The neutralization</w:t>
-      </w:r>
-      <w:proofErr w:type="gramEnd"/>
-      <w:r>
-        <w:t xml:space="preserve"> assumes that the virus is a function that does something and returns.</w:t>
-      </w:r>
-      <w:r>
-        <w:br/>
-      </w:r>
-    </w:p>
-    <w:p>
-      <w:pPr>
+      </w:pPr>
+      <w:r>
         <w:rPr>
           <w:b/>
           <w:bCs/>
         </w:rPr>
-      </w:pPr>
+        <w:t xml:space="preserve">Part 2a: Using </w:t>
+      </w:r>
+      <w:proofErr w:type="spellStart"/>
       <w:r>
         <w:rPr>
           <w:b/>
           <w:bCs/>
         </w:rPr>
-        <w:t xml:space="preserve">Part 2a: Using </w:t>
-      </w:r>
-      <w:proofErr w:type="spellStart"/>
+        <w:t>hexedit</w:t>
+      </w:r>
+      <w:proofErr w:type="spellEnd"/>
+    </w:p>
+    <w:p>
+      <w:r>
+        <w:t>In this part, you are required to apply your virus detector to a file, which is infected by a very simple virus that prints the sentence </w:t>
+      </w:r>
       <w:r>
         <w:rPr>
           <w:b/>
           <w:bCs/>
         </w:rPr>
+        <w:t>'I am virus1!'</w:t>
+      </w:r>
+      <w:r>
+        <w:t xml:space="preserve"> to the standard output. You are expected to cancel the effect of the virus by using the </w:t>
+      </w:r>
+      <w:proofErr w:type="spellStart"/>
+      <w:r>
         <w:t>hexedit</w:t>
       </w:r>
       <w:proofErr w:type="spellEnd"/>
-    </w:p>
-    <w:p>
-      <w:r>
-        <w:t>In this part, you are required to apply your virus detector to a file, which is infected by a very simple virus that prints the sentence </w:t>
-      </w:r>
-      <w:r>
-        <w:rPr>
-          <w:b/>
-          <w:bCs/>
-        </w:rPr>
-        <w:t>'I am virus1!'</w:t>
-      </w:r>
-      <w:r>
-        <w:t xml:space="preserve"> to the standard output. You are expected to cancel the effect of the virus by using the </w:t>
-      </w:r>
-      <w:proofErr w:type="spellStart"/>
-      <w:proofErr w:type="gramStart"/>
-      <w:r>
-        <w:t>hexedit</w:t>
-      </w:r>
-      <w:proofErr w:type="spellEnd"/>
-      <w:r>
-        <w:t>(</w:t>
-      </w:r>
-      <w:proofErr w:type="gramEnd"/>
-      <w:r>
-        <w:t>1) tool after you find its location and size using your virus detector.</w:t>
+      <w:r>
+        <w:t>(1) tool after you find its location and size using your virus detector.</w:t>
       </w:r>
       <w:r>
         <w:br/>
@@ -2147,15 +1929,7 @@
       </w:r>
       <w:r>
         <w:br/>
-        <w:t>2. Set the file permissions (</w:t>
-      </w:r>
-      <w:proofErr w:type="gramStart"/>
-      <w:r>
-        <w:t>in order to</w:t>
-      </w:r>
-      <w:proofErr w:type="gramEnd"/>
-      <w:r>
-        <w:t xml:space="preserve"> make it executable) using </w:t>
+        <w:t xml:space="preserve">2. Set the file permissions (in order to make it executable) using </w:t>
       </w:r>
       <w:proofErr w:type="spellStart"/>
       <w:r>
@@ -2171,15 +1945,7 @@
       </w:r>
       <w:proofErr w:type="spellEnd"/>
       <w:r>
-        <w:t xml:space="preserve"> </w:t>
-      </w:r>
-      <w:proofErr w:type="gramStart"/>
-      <w:r>
-        <w:t>infected, and</w:t>
-      </w:r>
-      <w:proofErr w:type="gramEnd"/>
-      <w:r>
-        <w:t xml:space="preserve"> </w:t>
+        <w:t xml:space="preserve"> infected, and </w:t>
       </w:r>
       <w:r>
         <w:lastRenderedPageBreak/>
@@ -2231,15 +1997,7 @@
       </w:r>
       <w:proofErr w:type="spellEnd"/>
       <w:r>
-        <w:t xml:space="preserve">. It is also a good idea to do this before implementing part 2b, so you know that the code you write is getting the correct locations for </w:t>
-      </w:r>
-      <w:proofErr w:type="gramStart"/>
-      <w:r>
-        <w:t>actually neutralizing</w:t>
-      </w:r>
-      <w:proofErr w:type="gramEnd"/>
-      <w:r>
-        <w:t xml:space="preserve"> the viruses.</w:t>
+        <w:t>. It is also a good idea to do this before implementing part 2b, so you know that the code you write is getting the correct locations for actually neutralizing the viruses.</w:t>
       </w:r>
     </w:p>
     <w:p>
@@ -2271,23 +2029,7 @@
         </w:numPr>
       </w:pPr>
       <w:r>
-        <w:t xml:space="preserve">Implement the "Fix file" option: </w:t>
-      </w:r>
-      <w:proofErr w:type="gramStart"/>
-      <w:r>
-        <w:t>scan for</w:t>
-      </w:r>
-      <w:proofErr w:type="gramEnd"/>
-      <w:r>
-        <w:t xml:space="preserve"> all viruses in the suspected FILE (the one selected for inspection by the user</w:t>
-      </w:r>
-      <w:proofErr w:type="gramStart"/>
-      <w:r>
-        <w:t>), and</w:t>
-      </w:r>
-      <w:proofErr w:type="gramEnd"/>
-      <w:r>
-        <w:t xml:space="preserve"> neutralize them automatically by modifying first byte of the virus (equal to the first byte of the signature) to the RET instruction. Note that the fix should be done for each of the viruses detected in the file, as there may be more than one.</w:t>
+        <w:t>Implement the "Fix file" option: scan for all viruses in the suspected FILE (the one selected for inspection by the user), and neutralize them automatically by modifying first byte of the virus (equal to the first byte of the signature) to the RET instruction. Note that the fix should be done for each of the viruses detected in the file, as there may be more than one.</w:t>
       </w:r>
     </w:p>
     <w:p>
@@ -2306,19 +2048,11 @@
       </w:r>
       <w:proofErr w:type="spellStart"/>
       <w:r>
-        <w:t>neutralize_</w:t>
-      </w:r>
-      <w:proofErr w:type="gramStart"/>
-      <w:r>
-        <w:t>virus</w:t>
-      </w:r>
-      <w:proofErr w:type="spellEnd"/>
-      <w:r>
-        <w:t>(</w:t>
-      </w:r>
-      <w:proofErr w:type="gramEnd"/>
-      <w:r>
-        <w:t>char *</w:t>
+        <w:t>neutralize_virus</w:t>
+      </w:r>
+      <w:proofErr w:type="spellEnd"/>
+      <w:r>
+        <w:t>(char *</w:t>
       </w:r>
       <w:proofErr w:type="spellStart"/>
       <w:r>
@@ -2348,28 +2082,21 @@
         <w:t xml:space="preserve">Hints: use </w:t>
       </w:r>
       <w:proofErr w:type="spellStart"/>
-      <w:proofErr w:type="gramStart"/>
       <w:r>
         <w:t>fseek</w:t>
       </w:r>
       <w:proofErr w:type="spellEnd"/>
       <w:r>
+        <w:t xml:space="preserve">( ), </w:t>
+      </w:r>
+      <w:proofErr w:type="spellStart"/>
+      <w:r>
+        <w:t>fwrite</w:t>
+      </w:r>
+      <w:proofErr w:type="spellEnd"/>
+      <w:r>
         <w:t>( )</w:t>
       </w:r>
-      <w:proofErr w:type="gramEnd"/>
-      <w:r>
-        <w:t xml:space="preserve">, </w:t>
-      </w:r>
-      <w:proofErr w:type="spellStart"/>
-      <w:proofErr w:type="gramStart"/>
-      <w:r>
-        <w:t>fwrite</w:t>
-      </w:r>
-      <w:proofErr w:type="spellEnd"/>
-      <w:r>
-        <w:t>( )</w:t>
-      </w:r>
-      <w:proofErr w:type="gramEnd"/>
     </w:p>
     <w:p>
       <w:pPr>

</xml_diff>